<commit_message>
Roteiro Rick: revisão anti-IA e retenção do roteiro completo
Co-Authored-By: Claude Opus 5.5 <noreply@anthropic.com>
Claude-Session: https://claude.ai/code/session_01MJjUEEZrxQDEUifKK2vj9g
</commit_message>
<xml_diff>
--- a/roteiros/rick/Rick_Roteiro_Completo.docx
+++ b/roteiros/rick/Rick_Roteiro_Completo.docx
@@ -15,7 +15,7 @@
         <w:rPr>
           <w:color w:val="C00000"/>
         </w:rPr>
-        <w:t>Rick passou quarenta anos tentando salvar o parceiro da própria destruição. E, numa segunda-feira de setembro, foi ele quem não voltou para casa.</w:t>
+        <w:t>Rick passou quarenta anos tentando salvar o parceiro da própria destruição. E foi ele quem não voltou para casa.</w:t>
       </w:r>
     </w:p>
     <w:p>
@@ -23,7 +23,7 @@
         <w:rPr>
           <w:color w:val="C00000"/>
         </w:rPr>
-        <w:t>O que os bombeiros encontraram no meio da mata, depois de quase vinte horas de busca, é algo que até hoje ninguém conseguiu explicar.</w:t>
+        <w:t>O que os bombeiros encontraram naquele helicóptero, até hoje, ninguém conseguiu explicar.</w:t>
       </w:r>
     </w:p>
     <w:p>
@@ -31,7 +31,7 @@
         <w:rPr>
           <w:color w:val="C00000"/>
         </w:rPr>
-        <w:t>E existe um áudio, com a voz dele, enviado poucas horas antes, que hoje ninguém consegue ouvir sem sentir um frio subindo pela espinha. Fique comigo até o final, porque você vai saber o que encontraram naquele helicóptero. E por que aquela mensagem, hoje, soa como uma despedida.</w:t>
+        <w:t>E existe um áudio dele, gravado horas antes da queda, que hoje soa como uma despedida. Fique até o final.</w:t>
       </w:r>
     </w:p>
     <w:p>
@@ -207,7 +207,7 @@
         <w:rPr>
           <w:color w:val="C00000"/>
         </w:rPr>
-        <w:t>E aqui é importante você prestar atenção num objeto que vai voltar várias vezes nessa história. Uma gravação. Uma gravação que Rick não queria lançar de jeito nenhum e que ele queria manter longe do público. Décadas depois, essa mesma música seria cantada por ele numa festa, dois dias antes de embarcar naquele helicóptero.</w:t>
+        <w:t>Agora preste atenção num objeto que vai voltar várias vezes nessa história. Uma gravação. Uma gravação que Rick não queria lançar de jeito nenhum e que ele queria manter longe do público. Décadas depois, essa mesma música seria cantada por ele numa festa, dois dias antes de embarcar naquele helicóptero.</w:t>
       </w:r>
     </w:p>
     <w:p>
@@ -591,7 +591,7 @@
         <w:rPr>
           <w:color w:val="000000"/>
         </w:rPr>
-        <w:t>E aqui existe um detalhe que pouca gente percebe.</w:t>
+        <w:t>E tem um detalhe nisso tudo que quase ninguém percebeu.</w:t>
       </w:r>
     </w:p>
     <w:p>
@@ -895,7 +895,7 @@
         <w:rPr>
           <w:color w:val="000000"/>
         </w:rPr>
-        <w:t>Guarde o nome desse estado. Santa Catarina. Porque, a partir dali, ele nunca mais sairia da história de Rick.</w:t>
+        <w:t>Anote o nome desse estado. Santa Catarina. Porque, a partir dali, ele nunca mais sairia da história de Rick.</w:t>
       </w:r>
     </w:p>
     <w:p>
@@ -943,7 +943,7 @@
         <w:rPr>
           <w:color w:val="000000"/>
         </w:rPr>
-        <w:t>Os shows ficaram menores. E as rádios continuavam tocando as músicas antigas da dupla, e não as novas.</w:t>
+        <w:t>Os shows ficaram menores. E as rádios continuavam tocando as músicas antigas da dupla, enquanto as novas quase não apareciam.</w:t>
       </w:r>
     </w:p>
     <w:p>
@@ -991,7 +991,7 @@
         <w:rPr>
           <w:color w:val="000000"/>
         </w:rPr>
-        <w:t>E, dessa vez, não ia ser num palco. Ia ser numa rua de São Paulo, com uma câmera gravando tudo.</w:t>
+        <w:t>E, dessa vez, ela ia se abrir numa rua de São Paulo, com uma câmera gravando tudo.</w:t>
       </w:r>
     </w:p>
     <w:p>
@@ -1063,7 +1063,7 @@
         <w:rPr>
           <w:color w:val="000000"/>
         </w:rPr>
-        <w:t>Mas naquela segunda-feira, Rick não estava a caminho de um show.</w:t>
+        <w:t>Mas naquela segunda-feira, a agenda de Rick era outra.</w:t>
       </w:r>
     </w:p>
     <w:p>
@@ -1343,7 +1343,7 @@
         <w:rPr>
           <w:color w:val="C00000"/>
         </w:rPr>
-        <w:t>E aqui existe um número que pouca gente parou para pensar. Cerca de quarenta bombeiros entraram na operação, com cães farejadores e drones de câmera térmica, capazes de enxergar o calor de um corpo humano no meio da escuridão. Tudo isso voltado para um pedaço de montanha. E, mesmo assim, a noite inteira passou sem uma única resposta.</w:t>
+        <w:t>Tem um número nessa operação que dá a dimensão do desespero. Cerca de quarenta bombeiros entraram na operação, com cães farejadores e drones de câmera térmica, capazes de enxergar o calor de um corpo humano no meio da escuridão. Tudo isso voltado para um pedaço de montanha. E, mesmo assim, a noite inteira passou sem uma única resposta.</w:t>
       </w:r>
     </w:p>
     <w:p>
@@ -1503,7 +1503,7 @@
         <w:rPr>
           <w:color w:val="1F4EB4"/>
         </w:rPr>
-        <w:t>É isso que até hoje ninguém consegue explicar. Cinco homens caíram na serra catarinense em completo silêncio, como se o helicóptero tivesse simplesmente se apagado do céu.</w:t>
+        <w:t>Cinco homens caíram na serra catarinense em completo silêncio, como se o helicóptero tivesse simplesmente se apagado do céu.</w:t>
       </w:r>
     </w:p>
     <w:p>
@@ -1647,7 +1647,7 @@
         <w:rPr>
           <w:color w:val="000000"/>
         </w:rPr>
-        <w:t>E aqui entra mais um objeto dessa história. Um texto. Um desabafo que Rick publicou nas redes sociais depois do acidente de São Paulo, e que hoje, relido depois da morte dele, pesa de um jeito diferente.</w:t>
+        <w:t>Nesse ponto entra mais um objeto dessa história. Um texto. Um desabafo que Rick publicou nas redes sociais depois do acidente de São Paulo, e que hoje, relido depois da morte dele, pesa de um jeito diferente.</w:t>
       </w:r>
     </w:p>
     <w:p>
@@ -1727,7 +1727,7 @@
         <w:rPr>
           <w:color w:val="C00000"/>
         </w:rPr>
-        <w:t>Guarde essas duas palavras. Paz no coração. Porque foi atrás dessa paz que Rick passou os anos seguintes. E, por uma ironia cruel, foi justamente a caminho do lugar onde ele buscava sossego, a casa de campo na serra, que tudo terminou.</w:t>
+        <w:t>Essas duas palavras vão voltar. Paz no coração. Porque foi atrás dessa paz que Rick passou os anos seguintes. E, por uma ironia cruel, foi justamente a caminho do lugar onde ele buscava sossego, a casa de campo na serra, que tudo terminou.</w:t>
       </w:r>
     </w:p>
     <w:p>
@@ -1943,7 +1943,7 @@
         <w:rPr>
           <w:color w:val="C00000"/>
         </w:rPr>
-        <w:t>Lembre bem desse endereço. São Joaquim. Porque era exatamente para lá que o helicóptero voava naquela segunda-feira. Rick não estava indo para um show nem para um compromisso qualquer. Estava indo almoçar no lugar que ele tinha escolhido para descansar.</w:t>
+        <w:t>Lembre bem desse endereço. São Joaquim. Porque era exatamente para lá que o helicóptero voava naquela segunda-feira. Naquele dia, Rick ia almoçar no lugar que tinha escolhido para descansar.</w:t>
       </w:r>
     </w:p>
     <w:p>
@@ -1975,7 +1975,7 @@
         <w:rPr>
           <w:color w:val="C00000"/>
         </w:rPr>
-        <w:t>E é essa coisa que faz muita gente sentir um frio na barriga até hoje. Porque quando você colocar lado a lado o que aconteceu em dois mil e vinte e quatro e o que aconteceu em dois mil e vinte e seis, vai perceber que o destino já tinha avisado Rick. Com todas as letras.</w:t>
+        <w:t>E é essa coisa que faz muita gente perder o sono até hoje. Porque quando você colocar lado a lado o que aconteceu em dois mil e vinte e quatro e o que aconteceu em dois mil e vinte e seis, vai perceber que o destino já tinha avisado Rick. Com todas as letras.</w:t>
       </w:r>
     </w:p>
     <w:p>
@@ -2207,6 +2207,14 @@
         <w:rPr>
           <w:color w:val="000000"/>
         </w:rPr>
+        <w:t>Uma música que atravessou vinte e cinco anos de festas, com pais e filhas girando no meio do salão, voltou uma última vez para a voz de quem a escreveu, diante de uma menina de quinze anos.</w:t>
+      </w:r>
+    </w:p>
+    <w:p>
+      <w:r>
+        <w:rPr>
+          <w:color w:val="000000"/>
+        </w:rPr>
         <w:t>Rick cantou para a filha de outro pai o que tinha escrito para a própria filha. E dois dias depois, estava morto.</w:t>
       </w:r>
     </w:p>
@@ -2431,15 +2439,7 @@
         <w:rPr>
           <w:color w:val="000000"/>
         </w:rPr>
-        <w:t>E o helicóptero nunca chegou.</w:t>
-      </w:r>
-    </w:p>
-    <w:p>
-      <w:r>
-        <w:rPr>
-          <w:color w:val="000000"/>
-        </w:rPr>
-        <w:t>Nem a São Joaquim, onde Rick ia almoçar na casa de campo. Nem a Rancho Queimado, onde alguém esperava por ele.</w:t>
+        <w:t>E o helicóptero nunca chegou a São Joaquim, onde Rick ia almoçar na casa de campo, nem a Rancho Queimado, onde alguém esperava por ele.</w:t>
       </w:r>
     </w:p>
     <w:p>
@@ -2701,6 +2701,14 @@
     <w:p>
       <w:r>
         <w:rPr>
+          <w:color w:val="000000"/>
+        </w:rPr>
+        <w:t>Cinco histórias interrompidas no mesmo pedaço de mata. Um cantor, um empresário, um videomaker que registrava a viagem e dois pilotos responsáveis por levar todos em segurança até a serra. Cada um deles saiu de casa naquela segunda-feira com hora marcada para voltar.</w:t>
+      </w:r>
+    </w:p>
+    <w:p>
+      <w:r>
+        <w:rPr>
           <w:color w:val="C00000"/>
         </w:rPr>
         <w:t>Mas havia uma pessoa de quem o Brasil inteiro esperava ouvir alguma coisa. Uma pessoa que tinha dividido o palco com Rick por quarenta anos. Que tinha sido parceiro, motivo de vergonha e, no fim, reconciliação. E quando ele finalmente falou, as palavras dele pesaram mais do que qualquer homenagem.</w:t>
@@ -2823,7 +2831,7 @@
         <w:rPr>
           <w:color w:val="C00000"/>
         </w:rPr>
-        <w:t>E aqui existe uma pergunta que ainda não tem resposta. Uma pergunta que as cinco famílias vão carregar por meses. O que aconteceu dentro daquele helicóptero nos minutos em que ele parou de dar notícias?</w:t>
+        <w:t>Uma pergunta continua sem resposta. Uma pergunta que as cinco famílias vão carregar por meses. O que aconteceu dentro daquele helicóptero nos minutos em que ele parou de dar notícias?</w:t>
       </w:r>
     </w:p>
     <w:p>
@@ -2839,7 +2847,7 @@
         <w:rPr>
           <w:color w:val="000000"/>
         </w:rPr>
-        <w:t>Em casos como esse, o relatório final costuma levar muitos meses para ficar pronto. E ele tem um objetivo específico: entender o que deu errado para evitar que aconteça de novo. A investigação não existe para apontar culpados.</w:t>
+        <w:t>Em casos como esse, o relatório final costuma levar muitos meses para ficar pronto. E ele tem um objetivo específico: entender o que deu errado para evitar que aconteça de novo, sem apontar culpados.</w:t>
       </w:r>
     </w:p>
     <w:p>
@@ -2855,15 +2863,7 @@
         <w:rPr>
           <w:color w:val="000000"/>
         </w:rPr>
-        <w:t>Ninguém sabe ainda por que um helicóptero moderno caiu sem emitir nenhum alerta. Também não se sabe o que os pilotos encontraram à frente quando entraram na serra sob aviso de tempestade, nem o que aconteceu nos minutos entre o último sinal do celular e o silêncio completo.</w:t>
-      </w:r>
-    </w:p>
-    <w:p>
-      <w:r>
-        <w:rPr>
-          <w:color w:val="000000"/>
-        </w:rPr>
-        <w:t>Nenhuma dessas respostas foi divulgada até agora.</w:t>
+        <w:t>O Brasil ainda espera saber por que um helicóptero moderno caiu sem emitir nenhum alerta, o que os pilotos encontraram à frente quando entraram na serra sob aviso de tempestade e o que aconteceu nos minutos entre o último sinal do celular e o silêncio completo.</w:t>
       </w:r>
     </w:p>
     <w:p>
@@ -2927,7 +2927,7 @@
         <w:rPr>
           <w:color w:val="000000"/>
         </w:rPr>
-        <w:t>Lembra do ano que eu te pedi para gravar na memória, lá no começo?</w:t>
+        <w:t>Volte ao ano que eu te pedi para gravar na memória, lá no começo.</w:t>
       </w:r>
     </w:p>
     <w:p>
@@ -2943,15 +2943,7 @@
         <w:rPr>
           <w:color w:val="000000"/>
         </w:rPr>
-        <w:t>Volte comigo a esse ano.</w:t>
-      </w:r>
-    </w:p>
-    <w:p>
-      <w:r>
-        <w:rPr>
-          <w:color w:val="000000"/>
-        </w:rPr>
-        <w:t>Em dois mil e um, "Filha" entrou no disco "É Dez, É Cem, É Mil". A música que Rick não queria gravar. A música que ele achava pessoal demais. A música que Renner insistiu para lançar. E a música que, vinte e cinco anos depois, Rick cantou na festa de quinze anos em Sorriso, dois dias antes de morrer.</w:t>
+        <w:t>Em dois mil e um, "Filha" entrou no disco "É Dez, É Cem, É Mil". A música que Rick achava pessoal demais para gravar e que Renner insistiu para lançar. A mesma que, vinte e cinco anos depois, Rick cantou na festa de quinze anos em Sorriso, dois dias antes de morrer.</w:t>
       </w:r>
     </w:p>
     <w:p>
@@ -3015,7 +3007,7 @@
         <w:rPr>
           <w:color w:val="000000"/>
         </w:rPr>
-        <w:t>É isso que dá frio na espinha quando se olha para a história inteira.</w:t>
+        <w:t>É aqui que a história inteira começa a fazer sentido.</w:t>
       </w:r>
     </w:p>
     <w:p>
@@ -3031,7 +3023,7 @@
         <w:rPr>
           <w:color w:val="000000"/>
         </w:rPr>
-        <w:t>Santa Catarina, onde ele anunciou o fim da dupla em dois mil e onze. Santa Catarina, onde bateu o carro na BR-282 em dois mil e vinte e quatro. Santa Catarina, onde o helicóptero caiu em dois mil e vinte e seis.</w:t>
+        <w:t>Foi em Santa Catarina que ele anunciou o fim da dupla em dois mil e onze, bateu o carro na BR-282 em dois mil e vinte e quatro e caiu com o helicóptero em dois mil e vinte e seis.</w:t>
       </w:r>
     </w:p>
     <w:p>
@@ -3087,7 +3079,7 @@
         <w:rPr>
           <w:color w:val="000000"/>
         </w:rPr>
-        <w:t>Existe uma coisa que pouca gente fala quando um artista morre.</w:t>
+        <w:t>Quando um artista morre, quase ninguém fala de uma coisa.</w:t>
       </w:r>
     </w:p>
     <w:p>
@@ -3119,15 +3111,15 @@
         <w:rPr>
           <w:color w:val="000000"/>
         </w:rPr>
-        <w:t>O que ficou de Rick para o Brasil foram as músicas.</w:t>
-      </w:r>
-    </w:p>
-    <w:p>
-      <w:r>
-        <w:rPr>
-          <w:color w:val="000000"/>
-        </w:rPr>
-        <w:t>O que ficou para a família foi outra coisa. Um áudio tranquilo, dizendo que chegava às três da tarde. Um vídeo numa festa de quinze anos. Uma carta que começa perguntando como se despede de alguém depois de quarenta e dois anos.</w:t>
+        <w:t>O Brasil guardou as músicas.</w:t>
+      </w:r>
+    </w:p>
+    <w:p>
+      <w:r>
+        <w:rPr>
+          <w:color w:val="000000"/>
+        </w:rPr>
+        <w:t>A família guardou um áudio tranquilo, dizendo que chegava às três da tarde. Um vídeo numa festa de quinze anos. Uma carta que começa perguntando como se despede de alguém depois de quarenta e dois anos.</w:t>
       </w:r>
     </w:p>
     <w:p>

</xml_diff>

<commit_message>
Roteiro Rick: ajuste final de extensão
Co-Authored-By: Claude Opus 5.5 <noreply@anthropic.com>
Claude-Session: https://claude.ai/code/session_01MJjUEEZrxQDEUifKK2vj9g
</commit_message>
<xml_diff>
--- a/roteiros/rick/Rick_Roteiro_Completo.docx
+++ b/roteiros/rick/Rick_Roteiro_Completo.docx
@@ -669,6 +669,14 @@
     <w:p>
       <w:r>
         <w:rPr>
+          <w:color w:val="000000"/>
+        </w:rPr>
+        <w:t>Enquanto a dupla lotava ginásios pelo país, as famílias de Eveline e Luís Antônio seguiam brigando na Justiça por uma reparação que nunca traria ninguém de volta.</w:t>
+      </w:r>
+    </w:p>
+    <w:p>
+      <w:r>
+        <w:rPr>
           <w:color w:val="C00000"/>
         </w:rPr>
         <w:t>E se você acha que esse foi o momento mais escuro da vida de Rick ao lado de Renner, ainda não viu nada. Porque o acidente de dois mil e um foi só o primeiro sinal de um padrão. Um padrão que Rick tentou quebrar durante décadas, e que ia se repetir de um jeito ainda mais humilhante.</w:t>
@@ -1791,7 +1799,7 @@
         <w:rPr>
           <w:color w:val="000000"/>
         </w:rPr>
-        <w:t>Foram três anos assim.</w:t>
+        <w:t>Foram três anos assim. Três anos em que Rick descobriu que a paz que tinha escolhido também cobrava um preço.</w:t>
       </w:r>
     </w:p>
     <w:p>

</xml_diff>